<commit_message>
docs: final dossier with release link
</commit_message>
<xml_diff>
--- a/docs/K068_K075_K081_IVRAR_Group Project_04_Technical_Dossier_FINAL.docx
+++ b/docs/K068_K075_K081_IVRAR_Group Project_04_Technical_Dossier_FINAL.docx
@@ -4163,17 +4163,8 @@
                     <w:sz w:val="12"/>
                     <w:szCs w:val="12"/>
                   </w:rPr>
-                  <w:t>/</w:t>
+                  <w:t>https://github.com/sunny-nanade/NMIMS-MPSTME-IVRAR-2026/tree/main/Group_04_Rishi_Rahul_Srinidi/Final%20Build%20APK</w:t>
                 </w:r>
-                <w:proofErr w:type="spellStart"/>
-                <w:r>
-                  <w:rPr>
-                    <w:sz w:val="12"/>
-                    <w:szCs w:val="12"/>
-                  </w:rPr>
-                  <w:t>FinalBuildAPK</w:t>
-                </w:r>
-                <w:proofErr w:type="spellEnd"/>
               </w:sdtContent>
             </w:sdt>
           </w:p>

</xml_diff>